<commit_message>
changed solar to PVWatts calculator
</commit_message>
<xml_diff>
--- a/Baseline_methodology+data.docx
+++ b/Baseline_methodology+data.docx
@@ -1894,6 +1894,66 @@
     </w:p>
     <w:p>
       <w:pPr>
+        <w:rPr>
+          <w:rFonts w:ascii="Arial" w:hAnsi="Arial" w:cs="Arial"/>
+          <w:sz w:val="24"/>
+          <w:szCs w:val="24"/>
+          <w:lang w:val="en-US"/>
+        </w:rPr>
+      </w:pPr>
+      <w:r>
+        <w:rPr>
+          <w:rFonts w:ascii="Arial" w:hAnsi="Arial" w:cs="Arial"/>
+          <w:sz w:val="24"/>
+          <w:szCs w:val="24"/>
+          <w:highlight w:val="yellow"/>
+          <w:lang w:val="en-US"/>
+        </w:rPr>
+        <w:t xml:space="preserve">Instead for easier and more accurate output we </w:t>
+      </w:r>
+      <w:r>
+        <w:rPr>
+          <w:rFonts w:ascii="Arial" w:hAnsi="Arial" w:cs="Arial"/>
+          <w:sz w:val="24"/>
+          <w:szCs w:val="24"/>
+          <w:highlight w:val="yellow"/>
+          <w:lang w:val="en-US"/>
+        </w:rPr>
+        <w:t xml:space="preserve">can </w:t>
+      </w:r>
+      <w:r>
+        <w:rPr>
+          <w:rFonts w:ascii="Arial" w:hAnsi="Arial" w:cs="Arial"/>
+          <w:sz w:val="24"/>
+          <w:szCs w:val="24"/>
+          <w:highlight w:val="yellow"/>
+          <w:lang w:val="en-US"/>
+        </w:rPr>
+        <w:t>use the PVWatts Calculator by NREL:</w:t>
+      </w:r>
+      <w:r>
+        <w:rPr>
+          <w:rFonts w:ascii="Arial" w:hAnsi="Arial" w:cs="Arial"/>
+          <w:sz w:val="24"/>
+          <w:szCs w:val="24"/>
+          <w:highlight w:val="yellow"/>
+          <w:lang w:val="en-US"/>
+        </w:rPr>
+        <w:br/>
+      </w:r>
+      <w:r>
+        <w:rPr>
+          <w:rFonts w:ascii="Arial" w:hAnsi="Arial" w:cs="Arial"/>
+          <w:sz w:val="24"/>
+          <w:szCs w:val="24"/>
+          <w:highlight w:val="yellow"/>
+          <w:lang w:val="en-US"/>
+        </w:rPr>
+        <w:t>https://developer.nlr.gov/docs/solar/pvwatts/v8/</w:t>
+      </w:r>
+    </w:p>
+    <w:p>
+      <w:pPr>
         <w:pStyle w:val="ListParagraph"/>
         <w:numPr>
           <w:ilvl w:val="0"/>
@@ -1961,26 +2021,15 @@
           <w:szCs w:val="24"/>
           <w:lang w:val="en-US" w:eastAsia="el-GR"/>
         </w:rPr>
-        <w:t xml:space="preserve"> (</w:t>
+        <w:t xml:space="preserve"> (Battery Energy Capacity in MWh):</w:t>
       </w:r>
       <w:r>
         <w:rPr>
           <w:rFonts w:ascii="Arial" w:eastAsia="Times New Roman" w:hAnsi="Arial" w:cs="Arial"/>
-          <w:b/>
-          <w:bCs/>
           <w:sz w:val="24"/>
           <w:szCs w:val="24"/>
           <w:lang w:val="en-US" w:eastAsia="el-GR"/>
         </w:rPr>
-        <w:t>Battery Energy Capacity in MWh):</w:t>
-      </w:r>
-      <w:r>
-        <w:rPr>
-          <w:rFonts w:ascii="Arial" w:eastAsia="Times New Roman" w:hAnsi="Arial" w:cs="Arial"/>
-          <w:sz w:val="24"/>
-          <w:szCs w:val="24"/>
-          <w:lang w:val="en-US" w:eastAsia="el-GR"/>
-        </w:rPr>
         <w:t xml:space="preserve"> </w:t>
       </w:r>
       <w:r>
@@ -1990,16 +2039,7 @@
           <w:szCs w:val="24"/>
           <w:lang w:val="en-US"/>
         </w:rPr>
-        <w:t>The total energy storage capacity.</w:t>
-      </w:r>
-      <w:r>
-        <w:rPr>
-          <w:rFonts w:ascii="Arial" w:hAnsi="Arial" w:cs="Arial"/>
-          <w:sz w:val="24"/>
-          <w:szCs w:val="24"/>
-          <w:lang w:val="en-US"/>
-        </w:rPr>
-        <w:t xml:space="preserve"> (We can use ambient temperature if we want to include PHVAC losses which </w:t>
+        <w:t xml:space="preserve">The total energy storage capacity. (We can use ambient temperature if we want to include PHVAC losses which </w:t>
       </w:r>
       <w:r>
         <w:rPr>
@@ -2038,25 +2078,7 @@
           <w:szCs w:val="24"/>
           <w:lang w:val="en-US"/>
         </w:rPr>
-        <w:t xml:space="preserve">For every hour, </w:t>
-      </w:r>
-      <w:r>
-        <w:rPr>
-          <w:rFonts w:ascii="Arial" w:hAnsi="Arial" w:cs="Arial"/>
-          <w:sz w:val="24"/>
-          <w:szCs w:val="24"/>
-          <w:lang w:val="en-US"/>
-        </w:rPr>
-        <w:t>we</w:t>
-      </w:r>
-      <w:r>
-        <w:rPr>
-          <w:rFonts w:ascii="Arial" w:hAnsi="Arial" w:cs="Arial"/>
-          <w:sz w:val="24"/>
-          <w:szCs w:val="24"/>
-          <w:lang w:val="en-US"/>
-        </w:rPr>
-        <w:t xml:space="preserve"> should calculate the new energy level in the battery:</w:t>
+        <w:t>For every hour, we should calculate the new energy level in the battery:</w:t>
       </w:r>
     </w:p>
     <w:p>
@@ -2146,16 +2168,7 @@
                   <w:szCs w:val="24"/>
                   <w:lang w:val="en-US"/>
                 </w:rPr>
-                <m:t>t</m:t>
-              </m:r>
-              <m:r>
-                <w:rPr>
-                  <w:rFonts w:ascii="Cambria Math" w:hAnsi="Cambria Math" w:cs="Arial"/>
-                  <w:sz w:val="24"/>
-                  <w:szCs w:val="24"/>
-                  <w:lang w:val="en-US"/>
-                </w:rPr>
-                <m:t>-1</m:t>
+                <m:t>t-1</m:t>
               </m:r>
             </m:sub>
           </m:sSub>
@@ -2756,25 +2769,7 @@
           <w:szCs w:val="24"/>
           <w:lang w:val="en-US"/>
         </w:rPr>
-        <w:t xml:space="preserve"> The deficit remaining after Solar_t and Battery</w:t>
-      </w:r>
-      <w:r>
-        <w:rPr>
-          <w:rFonts w:ascii="Arial" w:hAnsi="Arial" w:cs="Arial"/>
-          <w:sz w:val="24"/>
-          <w:szCs w:val="24"/>
-          <w:lang w:val="en-US"/>
-        </w:rPr>
-        <w:t xml:space="preserve"> </w:t>
-      </w:r>
-      <w:r>
-        <w:rPr>
-          <w:rFonts w:ascii="Arial" w:hAnsi="Arial" w:cs="Arial"/>
-          <w:sz w:val="24"/>
-          <w:szCs w:val="24"/>
-          <w:lang w:val="en-US"/>
-        </w:rPr>
-        <w:t>Discharge are applied to the load.</w:t>
+        <w:t xml:space="preserve"> The deficit remaining after Solar_t and Battery Discharge are applied to the load.</w:t>
       </w:r>
     </w:p>
     <w:p>
@@ -3041,7 +3036,6 @@
           <w:szCs w:val="24"/>
           <w:lang w:val="en-US"/>
         </w:rPr>
-        <w:lastRenderedPageBreak/>
         <w:t>How will our hourly simulation look like:</w:t>
       </w:r>
     </w:p>
@@ -5259,16 +5253,7 @@
           <w:szCs w:val="24"/>
           <w:lang w:val="en-US"/>
         </w:rPr>
-        <w:t>NREL ATB 2025 capital cost multipliers</w:t>
-      </w:r>
-      <w:r>
-        <w:rPr>
-          <w:rFonts w:ascii="Arial" w:hAnsi="Arial" w:cs="Arial"/>
-          <w:sz w:val="24"/>
-          <w:szCs w:val="24"/>
-          <w:lang w:val="en-US"/>
-        </w:rPr>
-        <w:t xml:space="preserve"> </w:t>
+        <w:t xml:space="preserve">NREL ATB 2025 capital cost multipliers </w:t>
       </w:r>
       <w:hyperlink r:id="rId10" w:history="1">
         <w:r>
@@ -5315,16 +5300,7 @@
           <w:szCs w:val="24"/>
           <w:lang w:val="en-US"/>
         </w:rPr>
-        <w:t xml:space="preserve"> regional fuel price forecasts</w:t>
-      </w:r>
-      <w:r>
-        <w:rPr>
-          <w:rFonts w:ascii="Arial" w:hAnsi="Arial" w:cs="Arial"/>
-          <w:sz w:val="24"/>
-          <w:szCs w:val="24"/>
-          <w:lang w:val="en-US"/>
-        </w:rPr>
-        <w:t xml:space="preserve"> </w:t>
+        <w:t xml:space="preserve"> regional fuel price forecasts </w:t>
       </w:r>
       <w:hyperlink r:id="rId11" w:history="1">
         <w:r>
@@ -5360,16 +5336,7 @@
           <w:szCs w:val="24"/>
           <w:lang w:val="en-US"/>
         </w:rPr>
-        <w:t>EIA AEO 2025</w:t>
-      </w:r>
-      <w:r>
-        <w:rPr>
-          <w:rFonts w:ascii="Arial" w:hAnsi="Arial" w:cs="Arial"/>
-          <w:sz w:val="24"/>
-          <w:szCs w:val="24"/>
-          <w:lang w:val="en-US"/>
-        </w:rPr>
-        <w:t xml:space="preserve"> (for capacity factors)</w:t>
+        <w:t>EIA AEO 2025 (for capacity factors)</w:t>
       </w:r>
       <w:r>
         <w:rPr>
@@ -5465,6 +5432,7 @@
               <w:szCs w:val="24"/>
               <w:lang w:val="en-US"/>
             </w:rPr>
+            <w:lastRenderedPageBreak/>
             <m:t xml:space="preserve">sLCOE= </m:t>
           </m:r>
           <m:f>
@@ -5902,7 +5870,6 @@
           <w:szCs w:val="24"/>
           <w:lang w:val="en-US"/>
         </w:rPr>
-        <w:lastRenderedPageBreak/>
         <w:t>E</w:t>
       </w:r>
       <w:r>
@@ -6165,25 +6132,7 @@
                   <w:szCs w:val="24"/>
                   <w:lang w:val="en-US"/>
                 </w:rPr>
-                <m:t>(</m:t>
-              </m:r>
-              <m:r>
-                <w:rPr>
-                  <w:rFonts w:ascii="Cambria Math" w:hAnsi="Cambria Math" w:cs="Arial"/>
-                  <w:sz w:val="24"/>
-                  <w:szCs w:val="24"/>
-                  <w:lang w:val="en-US"/>
-                </w:rPr>
-                <m:t>P</m:t>
-              </m:r>
-              <m:r>
-                <w:rPr>
-                  <w:rFonts w:ascii="Cambria Math" w:hAnsi="Cambria Math" w:cs="Arial"/>
-                  <w:sz w:val="24"/>
-                  <w:szCs w:val="24"/>
-                  <w:lang w:val="en-US"/>
-                </w:rPr>
-                <m:t>gri</m:t>
+                <m:t>(Pgri</m:t>
               </m:r>
               <m:sSub>
                 <m:sSubPr>
@@ -7179,6 +7128,7 @@
           <w:szCs w:val="24"/>
           <w:lang w:val="en-US"/>
         </w:rPr>
+        <w:lastRenderedPageBreak/>
         <w:t>SPP:</w:t>
       </w:r>
       <w:r>
@@ -7273,7 +7223,6 @@
           <w:szCs w:val="24"/>
           <w:lang w:val="en-US"/>
         </w:rPr>
-        <w:lastRenderedPageBreak/>
         <w:t xml:space="preserve">ISO-NE: </w:t>
       </w:r>
       <w:hyperlink r:id="rId18" w:history="1">
@@ -8953,6 +8902,7 @@
   <w:style w:type="character" w:default="1" w:styleId="DefaultParagraphFont">
     <w:name w:val="Default Paragraph Font"/>
     <w:uiPriority w:val="1"/>
+    <w:semiHidden/>
     <w:unhideWhenUsed/>
   </w:style>
   <w:style w:type="table" w:default="1" w:styleId="TableNormal">

</xml_diff>